<commit_message>
PO box and phone number changes
</commit_message>
<xml_diff>
--- a/2018 Giving Receipts.docx
+++ b/2018 Giving Receipts.docx
@@ -46,8 +46,6 @@
       <w:r>
         <w:t>{name}</w:t>
       </w:r>
-      <w:bookmarkStart w:id="0" w:name="_GoBack"/>
-      <w:bookmarkEnd w:id="0"/>
       <w:r>
         <w:t>,</w:t>
       </w:r>
@@ -323,9 +321,10 @@
     <w:sectPr>
       <w:headerReference w:type="even" r:id="rId8"/>
       <w:headerReference w:type="default" r:id="rId9"/>
-      <w:footerReference w:type="default" r:id="rId10"/>
-      <w:headerReference w:type="first" r:id="rId11"/>
-      <w:footerReference w:type="first" r:id="rId12"/>
+      <w:footerReference w:type="even" r:id="rId10"/>
+      <w:footerReference w:type="default" r:id="rId11"/>
+      <w:headerReference w:type="first" r:id="rId12"/>
+      <w:footerReference w:type="first" r:id="rId13"/>
       <w:pgSz w:w="12240" w:h="15840" w:code="1"/>
       <w:pgMar w:top="1440" w:right="1440" w:bottom="1440" w:left="1440" w:header="720" w:footer="720" w:gutter="0"/>
       <w:cols w:space="720"/>
@@ -363,172 +362,6 @@
 
 <file path=word/footer1.xml><?xml version="1.0" encoding="utf-8"?>
 <w:ftr xmlns:wpc="http://schemas.microsoft.com/office/word/2010/wordprocessingCanvas" xmlns:cx="http://schemas.microsoft.com/office/drawing/2014/chartex" xmlns:cx1="http://schemas.microsoft.com/office/drawing/2015/9/8/chartex" xmlns:cx2="http://schemas.microsoft.com/office/drawing/2015/10/21/chartex" xmlns:cx3="http://schemas.microsoft.com/office/drawing/2016/5/9/chartex" xmlns:cx4="http://schemas.microsoft.com/office/drawing/2016/5/10/chartex" xmlns:cx5="http://schemas.microsoft.com/office/drawing/2016/5/11/chartex" xmlns:cx6="http://schemas.microsoft.com/office/drawing/2016/5/12/chartex" xmlns:cx7="http://schemas.microsoft.com/office/drawing/2016/5/13/chartex" xmlns:cx8="http://schemas.microsoft.com/office/drawing/2016/5/14/chartex" xmlns:mc="http://schemas.openxmlformats.org/markup-compatibility/2006" xmlns:aink="http://schemas.microsoft.com/office/drawing/2016/ink" xmlns:am3d="http://schemas.microsoft.com/office/drawing/2017/model3d" xmlns:o="urn:schemas-microsoft-com:office:office" xmlns:r="http://schemas.openxmlformats.org/officeDocument/2006/relationships" xmlns:m="http://schemas.openxmlformats.org/officeDocument/2006/math" xmlns:v="urn:schemas-microsoft-com:vml" xmlns:wp14="http://schemas.microsoft.com/office/word/2010/wordprocessingDrawing" xmlns:wp="http://schemas.openxmlformats.org/drawingml/2006/wordprocessingDrawing" xmlns:w10="urn:schemas-microsoft-com:office:word" xmlns:w="http://schemas.openxmlformats.org/wordprocessingml/2006/main" xmlns:w14="http://schemas.microsoft.com/office/word/2010/wordml" xmlns:w15="http://schemas.microsoft.com/office/word/2012/wordml" xmlns:w16cid="http://schemas.microsoft.com/office/word/2016/wordml/cid" xmlns:w16se="http://schemas.microsoft.com/office/word/2015/wordml/symex" xmlns:wpg="http://schemas.microsoft.com/office/word/2010/wordprocessingGroup" xmlns:wpi="http://schemas.microsoft.com/office/word/2010/wordprocessingInk" xmlns:wne="http://schemas.microsoft.com/office/word/2006/wordml" xmlns:wps="http://schemas.microsoft.com/office/word/2010/wordprocessingShape" mc:Ignorable="w14 w15 w16se w16cid wp14">
-  <w:p>
-    <w:pPr>
-      <w:widowControl w:val="0"/>
-      <w:autoSpaceDE w:val="0"/>
-      <w:autoSpaceDN w:val="0"/>
-      <w:adjustRightInd w:val="0"/>
-      <w:spacing w:after="0" w:line="240" w:lineRule="auto"/>
-      <w:ind w:left="526" w:right="581"/>
-      <w:jc w:val="center"/>
-      <w:rPr>
-        <w:rFonts w:ascii="Times New Roman" w:hAnsi="Times New Roman"/>
-        <w:color w:val="282828"/>
-        <w:spacing w:val="16"/>
-        <w:sz w:val="18"/>
-        <w:szCs w:val="18"/>
-      </w:rPr>
-    </w:pPr>
-    <w:r>
-      <w:rPr>
-        <w:rFonts w:ascii="Times New Roman" w:hAnsi="Times New Roman"/>
-        <w:color w:val="282828"/>
-        <w:spacing w:val="16"/>
-        <w:sz w:val="18"/>
-        <w:szCs w:val="18"/>
-      </w:rPr>
-      <w:t xml:space="preserve">P.O. BOX 50118 | BALTIMORE, MD 21211 | 410-963-3606 | </w:t>
-    </w:r>
-    <w:hyperlink r:id="rId1" w:history="1">
-      <w:r>
-        <w:rPr>
-          <w:rStyle w:val="Hyperlink"/>
-          <w:rFonts w:ascii="Times New Roman" w:hAnsi="Times New Roman"/>
-          <w:spacing w:val="16"/>
-          <w:sz w:val="18"/>
-          <w:szCs w:val="18"/>
-        </w:rPr>
-        <w:t>www.gracelifechurch.com</w:t>
-      </w:r>
-    </w:hyperlink>
-  </w:p>
-  <w:p>
-    <w:pPr>
-      <w:widowControl w:val="0"/>
-      <w:autoSpaceDE w:val="0"/>
-      <w:autoSpaceDN w:val="0"/>
-      <w:adjustRightInd w:val="0"/>
-      <w:spacing w:after="0" w:line="240" w:lineRule="auto"/>
-      <w:ind w:left="526" w:right="581"/>
-      <w:jc w:val="center"/>
-      <w:rPr>
-        <w:rFonts w:ascii="Times New Roman" w:hAnsi="Times New Roman"/>
-        <w:color w:val="7F7F7F" w:themeColor="background1" w:themeShade="7F"/>
-        <w:spacing w:val="60"/>
-        <w:sz w:val="18"/>
-        <w:szCs w:val="18"/>
-      </w:rPr>
-    </w:pPr>
-  </w:p>
-  <w:p>
-    <w:pPr>
-      <w:widowControl w:val="0"/>
-      <w:autoSpaceDE w:val="0"/>
-      <w:autoSpaceDN w:val="0"/>
-      <w:adjustRightInd w:val="0"/>
-      <w:spacing w:after="0" w:line="240" w:lineRule="auto"/>
-      <w:ind w:left="526" w:right="581"/>
-      <w:jc w:val="center"/>
-      <w:rPr>
-        <w:rFonts w:ascii="Times New Roman" w:hAnsi="Times New Roman"/>
-        <w:color w:val="000000"/>
-        <w:sz w:val="18"/>
-        <w:szCs w:val="18"/>
-      </w:rPr>
-    </w:pPr>
-    <w:r>
-      <w:rPr>
-        <w:rFonts w:ascii="Times New Roman" w:hAnsi="Times New Roman"/>
-        <w:color w:val="7F7F7F" w:themeColor="background1" w:themeShade="7F"/>
-        <w:spacing w:val="60"/>
-        <w:sz w:val="18"/>
-        <w:szCs w:val="18"/>
-      </w:rPr>
-      <w:t>Page</w:t>
-    </w:r>
-    <w:r>
-      <w:rPr>
-        <w:rFonts w:ascii="Times New Roman" w:hAnsi="Times New Roman"/>
-        <w:color w:val="282828"/>
-        <w:spacing w:val="-24"/>
-        <w:sz w:val="18"/>
-        <w:szCs w:val="18"/>
-      </w:rPr>
-      <w:t xml:space="preserve">  </w:t>
-    </w:r>
-    <w:r>
-      <w:rPr>
-        <w:rFonts w:ascii="Times New Roman" w:hAnsi="Times New Roman"/>
-        <w:color w:val="282828"/>
-        <w:spacing w:val="-24"/>
-        <w:sz w:val="18"/>
-        <w:szCs w:val="18"/>
-      </w:rPr>
-      <w:fldChar w:fldCharType="begin"/>
-    </w:r>
-    <w:r>
-      <w:rPr>
-        <w:rFonts w:ascii="Times New Roman" w:hAnsi="Times New Roman"/>
-        <w:color w:val="282828"/>
-        <w:spacing w:val="-24"/>
-        <w:sz w:val="18"/>
-        <w:szCs w:val="18"/>
-      </w:rPr>
-      <w:instrText xml:space="preserve"> PAGE   \* MERGEFORMAT </w:instrText>
-    </w:r>
-    <w:r>
-      <w:rPr>
-        <w:rFonts w:ascii="Times New Roman" w:hAnsi="Times New Roman"/>
-        <w:color w:val="282828"/>
-        <w:spacing w:val="-24"/>
-        <w:sz w:val="18"/>
-        <w:szCs w:val="18"/>
-      </w:rPr>
-      <w:fldChar w:fldCharType="separate"/>
-    </w:r>
-    <w:r>
-      <w:rPr>
-        <w:rFonts w:ascii="Times New Roman" w:hAnsi="Times New Roman"/>
-        <w:b/>
-        <w:bCs/>
-        <w:noProof/>
-        <w:color w:val="282828"/>
-        <w:spacing w:val="-24"/>
-        <w:sz w:val="18"/>
-        <w:szCs w:val="18"/>
-      </w:rPr>
-      <w:t>2</w:t>
-    </w:r>
-    <w:r>
-      <w:rPr>
-        <w:rFonts w:ascii="Times New Roman" w:hAnsi="Times New Roman"/>
-        <w:b/>
-        <w:bCs/>
-        <w:noProof/>
-        <w:color w:val="282828"/>
-        <w:spacing w:val="-24"/>
-        <w:sz w:val="18"/>
-        <w:szCs w:val="18"/>
-      </w:rPr>
-      <w:fldChar w:fldCharType="end"/>
-    </w:r>
-    <w:r>
-      <w:rPr>
-        <w:rFonts w:ascii="Times New Roman" w:hAnsi="Times New Roman"/>
-        <w:color w:val="282828"/>
-        <w:spacing w:val="-24"/>
-        <w:sz w:val="18"/>
-        <w:szCs w:val="18"/>
-      </w:rPr>
-      <w:t xml:space="preserve"> </w:t>
-    </w:r>
-  </w:p>
-  <w:p>
-    <w:pPr>
-      <w:pStyle w:val="Footer"/>
-    </w:pPr>
-  </w:p>
   <w:p>
     <w:pPr>
       <w:pStyle w:val="Footer"/>
@@ -550,23 +383,251 @@
       <w:jc w:val="center"/>
       <w:rPr>
         <w:rFonts w:ascii="Times New Roman" w:hAnsi="Times New Roman"/>
-        <w:color w:val="000000"/>
-        <w:sz w:val="18"/>
-        <w:szCs w:val="18"/>
-      </w:rPr>
-    </w:pPr>
-    <w:r>
-      <w:tab/>
-    </w:r>
-    <w:r>
-      <w:rPr>
-        <w:rFonts w:ascii="Times New Roman" w:hAnsi="Times New Roman"/>
         <w:color w:val="282828"/>
         <w:spacing w:val="16"/>
         <w:sz w:val="18"/>
         <w:szCs w:val="18"/>
       </w:rPr>
-      <w:t>P.O. BOX 50118 | BALTIMORE, MD 21211 | 410-963-3606 | www.gracelifechurch.com</w:t>
+    </w:pPr>
+    <w:r>
+      <w:rPr>
+        <w:rFonts w:ascii="Times New Roman" w:hAnsi="Times New Roman"/>
+        <w:color w:val="282828"/>
+        <w:spacing w:val="16"/>
+        <w:sz w:val="18"/>
+        <w:szCs w:val="18"/>
+      </w:rPr>
+      <w:t xml:space="preserve">P.O. BOX 50118 | BALTIMORE, MD 21211 | 410-963-3606 | </w:t>
+    </w:r>
+    <w:hyperlink r:id="rId1" w:history="1">
+      <w:r>
+        <w:rPr>
+          <w:rStyle w:val="Hyperlink"/>
+          <w:rFonts w:ascii="Times New Roman" w:hAnsi="Times New Roman"/>
+          <w:spacing w:val="16"/>
+          <w:sz w:val="18"/>
+          <w:szCs w:val="18"/>
+        </w:rPr>
+        <w:t>www.gracelifechurch.com</w:t>
+      </w:r>
+    </w:hyperlink>
+  </w:p>
+  <w:p>
+    <w:pPr>
+      <w:widowControl w:val="0"/>
+      <w:autoSpaceDE w:val="0"/>
+      <w:autoSpaceDN w:val="0"/>
+      <w:adjustRightInd w:val="0"/>
+      <w:spacing w:after="0" w:line="240" w:lineRule="auto"/>
+      <w:ind w:left="526" w:right="581"/>
+      <w:jc w:val="center"/>
+      <w:rPr>
+        <w:rFonts w:ascii="Times New Roman" w:hAnsi="Times New Roman"/>
+        <w:color w:val="7F7F7F" w:themeColor="background1" w:themeShade="7F"/>
+        <w:spacing w:val="60"/>
+        <w:sz w:val="18"/>
+        <w:szCs w:val="18"/>
+      </w:rPr>
+    </w:pPr>
+  </w:p>
+  <w:p>
+    <w:pPr>
+      <w:widowControl w:val="0"/>
+      <w:autoSpaceDE w:val="0"/>
+      <w:autoSpaceDN w:val="0"/>
+      <w:adjustRightInd w:val="0"/>
+      <w:spacing w:after="0" w:line="240" w:lineRule="auto"/>
+      <w:ind w:left="526" w:right="581"/>
+      <w:jc w:val="center"/>
+      <w:rPr>
+        <w:rFonts w:ascii="Times New Roman" w:hAnsi="Times New Roman"/>
+        <w:color w:val="000000"/>
+        <w:sz w:val="18"/>
+        <w:szCs w:val="18"/>
+      </w:rPr>
+    </w:pPr>
+    <w:r>
+      <w:rPr>
+        <w:rFonts w:ascii="Times New Roman" w:hAnsi="Times New Roman"/>
+        <w:color w:val="7F7F7F" w:themeColor="background1" w:themeShade="7F"/>
+        <w:spacing w:val="60"/>
+        <w:sz w:val="18"/>
+        <w:szCs w:val="18"/>
+      </w:rPr>
+      <w:t>Page</w:t>
+    </w:r>
+    <w:r>
+      <w:rPr>
+        <w:rFonts w:ascii="Times New Roman" w:hAnsi="Times New Roman"/>
+        <w:color w:val="282828"/>
+        <w:spacing w:val="-24"/>
+        <w:sz w:val="18"/>
+        <w:szCs w:val="18"/>
+      </w:rPr>
+      <w:t xml:space="preserve">  </w:t>
+    </w:r>
+    <w:r>
+      <w:rPr>
+        <w:rFonts w:ascii="Times New Roman" w:hAnsi="Times New Roman"/>
+        <w:color w:val="282828"/>
+        <w:spacing w:val="-24"/>
+        <w:sz w:val="18"/>
+        <w:szCs w:val="18"/>
+      </w:rPr>
+      <w:fldChar w:fldCharType="begin"/>
+    </w:r>
+    <w:r>
+      <w:rPr>
+        <w:rFonts w:ascii="Times New Roman" w:hAnsi="Times New Roman"/>
+        <w:color w:val="282828"/>
+        <w:spacing w:val="-24"/>
+        <w:sz w:val="18"/>
+        <w:szCs w:val="18"/>
+      </w:rPr>
+      <w:instrText xml:space="preserve"> PAGE   \* MERGEFORMAT </w:instrText>
+    </w:r>
+    <w:r>
+      <w:rPr>
+        <w:rFonts w:ascii="Times New Roman" w:hAnsi="Times New Roman"/>
+        <w:color w:val="282828"/>
+        <w:spacing w:val="-24"/>
+        <w:sz w:val="18"/>
+        <w:szCs w:val="18"/>
+      </w:rPr>
+      <w:fldChar w:fldCharType="separate"/>
+    </w:r>
+    <w:r>
+      <w:rPr>
+        <w:rFonts w:ascii="Times New Roman" w:hAnsi="Times New Roman"/>
+        <w:b/>
+        <w:bCs/>
+        <w:noProof/>
+        <w:color w:val="282828"/>
+        <w:spacing w:val="-24"/>
+        <w:sz w:val="18"/>
+        <w:szCs w:val="18"/>
+      </w:rPr>
+      <w:t>2</w:t>
+    </w:r>
+    <w:r>
+      <w:rPr>
+        <w:rFonts w:ascii="Times New Roman" w:hAnsi="Times New Roman"/>
+        <w:b/>
+        <w:bCs/>
+        <w:noProof/>
+        <w:color w:val="282828"/>
+        <w:spacing w:val="-24"/>
+        <w:sz w:val="18"/>
+        <w:szCs w:val="18"/>
+      </w:rPr>
+      <w:fldChar w:fldCharType="end"/>
+    </w:r>
+    <w:r>
+      <w:rPr>
+        <w:rFonts w:ascii="Times New Roman" w:hAnsi="Times New Roman"/>
+        <w:color w:val="282828"/>
+        <w:spacing w:val="-24"/>
+        <w:sz w:val="18"/>
+        <w:szCs w:val="18"/>
+      </w:rPr>
+      <w:t xml:space="preserve"> </w:t>
+    </w:r>
+  </w:p>
+  <w:p>
+    <w:pPr>
+      <w:pStyle w:val="Footer"/>
+    </w:pPr>
+  </w:p>
+  <w:p>
+    <w:pPr>
+      <w:pStyle w:val="Footer"/>
+    </w:pPr>
+  </w:p>
+</w:ftr>
+</file>
+
+<file path=word/footer3.xml><?xml version="1.0" encoding="utf-8"?>
+<w:ftr xmlns:wpc="http://schemas.microsoft.com/office/word/2010/wordprocessingCanvas" xmlns:cx="http://schemas.microsoft.com/office/drawing/2014/chartex" xmlns:cx1="http://schemas.microsoft.com/office/drawing/2015/9/8/chartex" xmlns:cx2="http://schemas.microsoft.com/office/drawing/2015/10/21/chartex" xmlns:cx3="http://schemas.microsoft.com/office/drawing/2016/5/9/chartex" xmlns:cx4="http://schemas.microsoft.com/office/drawing/2016/5/10/chartex" xmlns:cx5="http://schemas.microsoft.com/office/drawing/2016/5/11/chartex" xmlns:cx6="http://schemas.microsoft.com/office/drawing/2016/5/12/chartex" xmlns:cx7="http://schemas.microsoft.com/office/drawing/2016/5/13/chartex" xmlns:cx8="http://schemas.microsoft.com/office/drawing/2016/5/14/chartex" xmlns:mc="http://schemas.openxmlformats.org/markup-compatibility/2006" xmlns:aink="http://schemas.microsoft.com/office/drawing/2016/ink" xmlns:am3d="http://schemas.microsoft.com/office/drawing/2017/model3d" xmlns:o="urn:schemas-microsoft-com:office:office" xmlns:r="http://schemas.openxmlformats.org/officeDocument/2006/relationships" xmlns:m="http://schemas.openxmlformats.org/officeDocument/2006/math" xmlns:v="urn:schemas-microsoft-com:vml" xmlns:wp14="http://schemas.microsoft.com/office/word/2010/wordprocessingDrawing" xmlns:wp="http://schemas.openxmlformats.org/drawingml/2006/wordprocessingDrawing" xmlns:w10="urn:schemas-microsoft-com:office:word" xmlns:w="http://schemas.openxmlformats.org/wordprocessingml/2006/main" xmlns:w14="http://schemas.microsoft.com/office/word/2010/wordml" xmlns:w15="http://schemas.microsoft.com/office/word/2012/wordml" xmlns:w16cid="http://schemas.microsoft.com/office/word/2016/wordml/cid" xmlns:w16se="http://schemas.microsoft.com/office/word/2015/wordml/symex" xmlns:wpg="http://schemas.microsoft.com/office/word/2010/wordprocessingGroup" xmlns:wpi="http://schemas.microsoft.com/office/word/2010/wordprocessingInk" xmlns:wne="http://schemas.microsoft.com/office/word/2006/wordml" xmlns:wps="http://schemas.microsoft.com/office/word/2010/wordprocessingShape" mc:Ignorable="w14 w15 w16se w16cid wp14">
+  <w:p>
+    <w:pPr>
+      <w:widowControl w:val="0"/>
+      <w:autoSpaceDE w:val="0"/>
+      <w:autoSpaceDN w:val="0"/>
+      <w:adjustRightInd w:val="0"/>
+      <w:spacing w:after="0" w:line="240" w:lineRule="auto"/>
+      <w:ind w:left="526" w:right="581"/>
+      <w:jc w:val="center"/>
+      <w:rPr>
+        <w:rFonts w:ascii="Times New Roman" w:hAnsi="Times New Roman"/>
+        <w:color w:val="000000"/>
+        <w:sz w:val="18"/>
+        <w:szCs w:val="18"/>
+      </w:rPr>
+    </w:pPr>
+    <w:r>
+      <w:tab/>
+    </w:r>
+    <w:r>
+      <w:rPr>
+        <w:rFonts w:ascii="Times New Roman" w:hAnsi="Times New Roman"/>
+        <w:color w:val="282828"/>
+        <w:spacing w:val="16"/>
+        <w:sz w:val="18"/>
+        <w:szCs w:val="18"/>
+      </w:rPr>
+      <w:t xml:space="preserve">P.O. BOX </w:t>
+    </w:r>
+    <w:r>
+      <w:rPr>
+        <w:rFonts w:ascii="Times New Roman" w:hAnsi="Times New Roman"/>
+        <w:color w:val="282828"/>
+        <w:spacing w:val="16"/>
+        <w:sz w:val="18"/>
+        <w:szCs w:val="18"/>
+      </w:rPr>
+      <w:t>186</w:t>
+    </w:r>
+    <w:r>
+      <w:rPr>
+        <w:rFonts w:ascii="Times New Roman" w:hAnsi="Times New Roman"/>
+        <w:color w:val="282828"/>
+        <w:spacing w:val="16"/>
+        <w:sz w:val="18"/>
+        <w:szCs w:val="18"/>
+      </w:rPr>
+      <w:t xml:space="preserve"> | BALTIMORE, MD </w:t>
+    </w:r>
+    <w:r>
+      <w:rPr>
+        <w:rFonts w:ascii="Times New Roman" w:hAnsi="Times New Roman"/>
+        <w:color w:val="282828"/>
+        <w:spacing w:val="16"/>
+        <w:sz w:val="18"/>
+        <w:szCs w:val="18"/>
+      </w:rPr>
+      <w:t>21044</w:t>
+    </w:r>
+    <w:r>
+      <w:rPr>
+        <w:rFonts w:ascii="Times New Roman" w:hAnsi="Times New Roman"/>
+        <w:color w:val="282828"/>
+        <w:spacing w:val="16"/>
+        <w:sz w:val="18"/>
+        <w:szCs w:val="18"/>
+      </w:rPr>
+      <w:t xml:space="preserve"> </w:t>
+    </w:r>
+    <w:bookmarkStart w:id="0" w:name="_GoBack"/>
+    <w:bookmarkEnd w:id="0"/>
+    <w:r>
+      <w:rPr>
+        <w:rFonts w:ascii="Times New Roman" w:hAnsi="Times New Roman"/>
+        <w:color w:val="282828"/>
+        <w:spacing w:val="16"/>
+        <w:sz w:val="18"/>
+        <w:szCs w:val="18"/>
+      </w:rPr>
+      <w:t>| www.gracelifechurch.com</w:t>
     </w:r>
     <w:r>
       <w:rPr>
@@ -647,7 +708,7 @@
           <v:path o:extrusionok="f" gradientshapeok="t" o:connecttype="rect"/>
           <o:lock v:ext="edit" aspectratio="t"/>
         </v:shapetype>
-        <v:shape id="WordPictureWatermark173986454" o:spid="_x0000_s2053" type="#_x0000_t75" style="position:absolute;margin-left:0;margin-top:0;width:781.25pt;height:778.8pt;z-index:-251657216;mso-position-horizontal:center;mso-position-horizontal-relative:margin;mso-position-vertical:center;mso-position-vertical-relative:margin" o:allowincell="f">
+        <v:shape id="WordPictureWatermark173986454" o:spid="_x0000_s2051" type="#_x0000_t75" alt="letterheadtemplate" style="position:absolute;margin-left:0;margin-top:0;width:781.25pt;height:778.8pt;z-index:-251657216;mso-wrap-edited:f;mso-width-percent:0;mso-height-percent:0;mso-position-horizontal:center;mso-position-horizontal-relative:margin;mso-position-vertical:center;mso-position-vertical-relative:margin;mso-width-percent:0;mso-height-percent:0" o:allowincell="f">
           <v:imagedata r:id="rId1" o:title="letterheadtemplate"/>
           <w10:wrap anchorx="margin" anchory="margin"/>
         </v:shape>
@@ -729,11 +790,11 @@
         </mc:Choice>
         <mc:Fallback>
           <w:pict>
-            <v:shapetype id="_x0000_t202" coordsize="21600,21600" o:spt="202" path="m,l,21600r21600,l21600,xe">
+            <v:shapetype w14:anchorId="20A86A2A" id="_x0000_t202" coordsize="21600,21600" o:spt="202" path="m,l,21600r21600,l21600,xe">
               <v:stroke joinstyle="miter"/>
               <v:path gradientshapeok="t" o:connecttype="rect"/>
             </v:shapetype>
-            <v:shape id="Text Box 2" o:spid="_x0000_s1026" type="#_x0000_t202" style="position:absolute;margin-left:-22.45pt;margin-top:34.45pt;width:343.45pt;height:122.45pt;z-index:251668480;visibility:visible;mso-wrap-style:square;mso-width-percent:0;mso-height-percent:0;mso-wrap-distance-left:9pt;mso-wrap-distance-top:3.6pt;mso-wrap-distance-right:9pt;mso-wrap-distance-bottom:3.6pt;mso-position-horizontal:absolute;mso-position-horizontal-relative:text;mso-position-vertical:absolute;mso-position-vertical-relative:text;mso-width-percent:0;mso-height-percent:0;mso-width-relative:margin;mso-height-relative:margin;v-text-anchor:top" o:gfxdata="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" filled="f" stroked="f">
+            <v:shape id="Text Box 2" o:spid="_x0000_s1026" type="#_x0000_t202" style="position:absolute;margin-left:-22.45pt;margin-top:34.45pt;width:343.45pt;height:122.45pt;z-index:251668480;visibility:visible;mso-wrap-style:square;mso-width-percent:0;mso-height-percent:0;mso-wrap-distance-left:9pt;mso-wrap-distance-top:3.6pt;mso-wrap-distance-right:9pt;mso-wrap-distance-bottom:3.6pt;mso-position-horizontal:absolute;mso-position-horizontal-relative:text;mso-position-vertical:absolute;mso-position-vertical-relative:text;mso-width-percent:0;mso-height-percent:0;mso-width-relative:margin;mso-height-relative:margin;v-text-anchor:top" o:gfxdata="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" filled="f" stroked="f">
               <v:textbox>
                 <w:txbxContent>
                   <w:p/>
@@ -769,7 +830,7 @@
           <v:path o:extrusionok="f" gradientshapeok="t" o:connecttype="rect"/>
           <o:lock v:ext="edit" aspectratio="t"/>
         </v:shapetype>
-        <v:shape id="WordPictureWatermark173986455" o:spid="_x0000_s2054" type="#_x0000_t75" style="position:absolute;margin-left:0;margin-top:0;width:781.25pt;height:778.8pt;z-index:-251656192;mso-position-horizontal:center;mso-position-horizontal-relative:margin;mso-position-vertical:center;mso-position-vertical-relative:margin" o:allowincell="f">
+        <v:shape id="WordPictureWatermark173986455" o:spid="_x0000_s2050" type="#_x0000_t75" alt="letterheadtemplate" style="position:absolute;margin-left:0;margin-top:0;width:781.25pt;height:778.8pt;z-index:-251656192;mso-wrap-edited:f;mso-width-percent:0;mso-height-percent:0;mso-position-horizontal:center;mso-position-horizontal-relative:margin;mso-position-vertical:center;mso-position-vertical-relative:margin;mso-width-percent:0;mso-height-percent:0" o:allowincell="f">
           <v:imagedata r:id="rId1" o:title="letterheadtemplate"/>
           <w10:wrap anchorx="margin" anchory="margin"/>
         </v:shape>
@@ -809,7 +870,7 @@
           <v:path o:extrusionok="f" gradientshapeok="t" o:connecttype="rect"/>
           <o:lock v:ext="edit" aspectratio="t"/>
         </v:shapetype>
-        <v:shape id="WordPictureWatermark173986453" o:spid="_x0000_s2052" type="#_x0000_t75" style="position:absolute;margin-left:-156.75pt;margin-top:-39.4pt;width:781.25pt;height:778.8pt;z-index:-251658240;mso-position-horizontal-relative:margin;mso-position-vertical-relative:margin" o:allowincell="f">
+        <v:shape id="WordPictureWatermark173986453" o:spid="_x0000_s2049" type="#_x0000_t75" alt="letterheadtemplate" style="position:absolute;margin-left:-156.75pt;margin-top:-39.4pt;width:781.25pt;height:778.8pt;z-index:-251658240;mso-wrap-edited:f;mso-width-percent:0;mso-height-percent:0;mso-position-horizontal-relative:margin;mso-position-vertical-relative:margin;mso-width-percent:0;mso-height-percent:0" o:allowincell="f">
           <v:imagedata r:id="rId1" o:title="letterheadtemplate"/>
           <w10:wrap anchorx="margin" anchory="margin"/>
         </v:shape>
@@ -836,7 +897,7 @@
       </w:pPr>
     </w:pPrDefault>
   </w:docDefaults>
-  <w:latentStyles w:defLockedState="0" w:defUIPriority="99" w:defSemiHidden="0" w:defUnhideWhenUsed="0" w:defQFormat="0" w:count="375">
+  <w:latentStyles w:defLockedState="0" w:defUIPriority="99" w:defSemiHidden="0" w:defUnhideWhenUsed="0" w:defQFormat="0" w:count="376">
     <w:lsdException w:name="Normal" w:uiPriority="0" w:qFormat="1"/>
     <w:lsdException w:name="heading 1" w:uiPriority="9" w:qFormat="1"/>
     <w:lsdException w:name="heading 2" w:semiHidden="1" w:uiPriority="9" w:unhideWhenUsed="1" w:qFormat="1"/>
@@ -942,7 +1003,6 @@
     <w:lsdException w:name="HTML Sample" w:semiHidden="1" w:unhideWhenUsed="1"/>
     <w:lsdException w:name="HTML Typewriter" w:semiHidden="1" w:unhideWhenUsed="1"/>
     <w:lsdException w:name="HTML Variable" w:semiHidden="1" w:unhideWhenUsed="1"/>
-    <w:lsdException w:name="Normal Table" w:semiHidden="1" w:unhideWhenUsed="1"/>
     <w:lsdException w:name="annotation subject" w:semiHidden="1" w:unhideWhenUsed="1"/>
     <w:lsdException w:name="No List" w:semiHidden="1" w:unhideWhenUsed="1"/>
     <w:lsdException w:name="Outline List 1" w:semiHidden="1" w:unhideWhenUsed="1"/>
@@ -989,10 +1049,8 @@
     <w:lsdException w:name="Table Subtle 2" w:semiHidden="1" w:unhideWhenUsed="1"/>
     <w:lsdException w:name="Table Web 1" w:semiHidden="1" w:unhideWhenUsed="1"/>
     <w:lsdException w:name="Table Web 2" w:semiHidden="1" w:unhideWhenUsed="1"/>
-    <w:lsdException w:name="Table Web 3" w:semiHidden="1" w:unhideWhenUsed="1"/>
     <w:lsdException w:name="Balloon Text" w:semiHidden="1" w:unhideWhenUsed="1"/>
     <w:lsdException w:name="Table Grid" w:uiPriority="39"/>
-    <w:lsdException w:name="Table Theme" w:semiHidden="1" w:unhideWhenUsed="1"/>
     <w:lsdException w:name="Placeholder Text" w:semiHidden="1"/>
     <w:lsdException w:name="No Spacing" w:uiPriority="1" w:qFormat="1"/>
     <w:lsdException w:name="Light Shading" w:uiPriority="60"/>
@@ -1212,6 +1270,7 @@
     <w:lsdException w:name="Smart Hyperlink" w:semiHidden="1" w:unhideWhenUsed="1"/>
     <w:lsdException w:name="Hashtag" w:semiHidden="1" w:unhideWhenUsed="1"/>
     <w:lsdException w:name="Unresolved Mention" w:semiHidden="1" w:unhideWhenUsed="1"/>
+    <w:lsdException w:name="Smart Link" w:semiHidden="1" w:unhideWhenUsed="1"/>
   </w:latentStyles>
   <w:style w:type="paragraph" w:default="1" w:styleId="Normal">
     <w:name w:val="Normal"/>
@@ -1572,7 +1631,7 @@
 </file>
 
 <file path=customXml/itemProps1.xml><?xml version="1.0" encoding="utf-8"?>
-<ds:datastoreItem xmlns:ds="http://schemas.openxmlformats.org/officeDocument/2006/customXml" ds:itemID="{90A74FF3-F4E1-4152-B3F1-58E5D6D35BF5}">
+<ds:datastoreItem xmlns:ds="http://schemas.openxmlformats.org/officeDocument/2006/customXml" ds:itemID="{54670A0E-44E3-2C4B-8D4B-B1096F9FB97E}">
   <ds:schemaRefs>
     <ds:schemaRef ds:uri="http://schemas.openxmlformats.org/officeDocument/2006/bibliography"/>
   </ds:schemaRefs>

</xml_diff>